<commit_message>
fix(docx): add support for custom code_block table style and fix Lua filter crash
</commit_message>
<xml_diff>
--- a/src-tauri/assets/reference.docx
+++ b/src-tauri/assets/reference.docx
@@ -1410,6 +1410,80 @@
       <w:spacing w:before="240" w:line="259" w:lineRule="auto"/>
       <w:outlineLvl w:val="9"/>
     </w:pPr>
+  </w:style>
+  <w:style w:type="table" w:customStyle="1" w:styleId="codeblock">
+    <w:name w:val="codeblock"/>
+    <w:basedOn w:val="TableNormal"/>
+    <w:uiPriority w:val="99"/>
+    <w:rsid w:val="00C34D5B"/>
+    <w:pPr>
+      <w:spacing w:after="0"/>
+    </w:pPr>
+    <w:rPr>
+      <w:rFonts w:ascii="Courier New" w:hAnsi="Courier New"/>
+    </w:rPr>
+    <w:tblPr>
+      <w:tblBorders>
+        <w:top w:val="single" w:sz="24" w:space="0" w:color="D9D9D9" w:themeColor="background1" w:themeShade="D9"/>
+        <w:left w:val="single" w:sz="24" w:space="0" w:color="D9D9D9" w:themeColor="background1" w:themeShade="D9"/>
+        <w:bottom w:val="single" w:sz="24" w:space="0" w:color="D9D9D9" w:themeColor="background1" w:themeShade="D9"/>
+        <w:right w:val="single" w:sz="24" w:space="0" w:color="D9D9D9" w:themeColor="background1" w:themeShade="D9"/>
+        <w:insideH w:val="single" w:sz="24" w:space="0" w:color="D9D9D9" w:themeColor="background1" w:themeShade="D9"/>
+        <w:insideV w:val="single" w:sz="24" w:space="0" w:color="D9D9D9" w:themeColor="background1" w:themeShade="D9"/>
+      </w:tblBorders>
+    </w:tblPr>
+    <w:tcPr>
+      <w:shd w:val="clear" w:color="auto" w:fill="D9D9D9" w:themeFill="background1" w:themeFillShade="D9"/>
+    </w:tcPr>
+  </w:style>
+  <w:style w:type="paragraph" w:styleId="Quote">
+    <w:name w:val="Quote"/>
+    <w:basedOn w:val="Normal"/>
+    <w:next w:val="Normal"/>
+    <w:link w:val="QuoteChar"/>
+    <w:autoRedefine/>
+    <w:rsid w:val="00B22E66"/>
+    <w:pPr>
+      <w:pBdr>
+        <w:left w:val="single" w:sz="24" w:space="4" w:color="auto"/>
+      </w:pBdr>
+      <w:spacing w:before="200" w:after="160"/>
+      <w:ind w:left="864" w:right="864"/>
+    </w:pPr>
+    <w:rPr>
+      <w:i/>
+      <w:iCs/>
+      <w:color w:val="404040" w:themeColor="text1" w:themeTint="BF"/>
+    </w:rPr>
+  </w:style>
+  <w:style w:type="character" w:customStyle="1" w:styleId="QuoteChar">
+    <w:name w:val="Quote Char"/>
+    <w:basedOn w:val="DefaultParagraphFont"/>
+    <w:link w:val="Quote"/>
+    <w:rsid w:val="00B22E66"/>
+    <w:rPr>
+      <w:i/>
+      <w:iCs/>
+      <w:color w:val="404040" w:themeColor="text1" w:themeTint="BF"/>
+    </w:rPr>
+  </w:style>
+  <w:style w:type="table" w:styleId="TableGrid">
+    <w:name w:val="Table Grid"/>
+    <w:basedOn w:val="TableNormal"/>
+    <w:rsid w:val="001D24A5"/>
+    <w:pPr>
+      <w:spacing w:after="0"/>
+    </w:pPr>
+    <w:tblPr>
+      <w:tblBorders>
+        <w:top w:val="single" w:sz="4" w:space="0" w:color="auto"/>
+        <w:left w:val="single" w:sz="4" w:space="0" w:color="auto"/>
+        <w:bottom w:val="single" w:sz="4" w:space="0" w:color="auto"/>
+        <w:right w:val="single" w:sz="4" w:space="0" w:color="auto"/>
+        <w:insideH w:val="single" w:sz="4" w:space="0" w:color="auto"/>
+        <w:insideV w:val="single" w:sz="4" w:space="0" w:color="auto"/>
+      </w:tblBorders>
+    </w:tblPr>
   </w:style>
 </w:styles>
 </file>

</xml_diff>

<commit_message>
fix(docx): apply default font Inter only to non-code blocks to allow custom code style fonts
</commit_message>
<xml_diff>
--- a/src-tauri/assets/reference.docx
+++ b/src-tauri/assets/reference.docx
@@ -1415,23 +1415,14 @@
     <w:name w:val="codeblock"/>
     <w:basedOn w:val="TableNormal"/>
     <w:uiPriority w:val="99"/>
-    <w:rsid w:val="00234637"/>
+    <w:rsid w:val="00E1507F"/>
     <w:pPr>
       <w:spacing w:after="0"/>
     </w:pPr>
     <w:rPr>
       <w:rFonts w:ascii="Courier New" w:hAnsi="Courier New"/>
     </w:rPr>
-    <w:tblPr>
-      <w:tblBorders>
-        <w:top w:val="single" w:sz="4" w:space="0" w:color="000000" w:themeColor="text1"/>
-        <w:left w:val="single" w:sz="4" w:space="0" w:color="000000" w:themeColor="text1"/>
-        <w:bottom w:val="single" w:sz="4" w:space="0" w:color="000000" w:themeColor="text1"/>
-        <w:right w:val="single" w:sz="4" w:space="0" w:color="000000" w:themeColor="text1"/>
-        <w:insideH w:val="single" w:sz="4" w:space="0" w:color="000000" w:themeColor="text1"/>
-        <w:insideV w:val="single" w:sz="4" w:space="0" w:color="000000" w:themeColor="text1"/>
-      </w:tblBorders>
-    </w:tblPr>
+    <w:tblPr/>
     <w:tcPr>
       <w:shd w:val="clear" w:color="auto" w:fill="D9D9D9" w:themeFill="background1" w:themeFillShade="D9"/>
     </w:tcPr>
@@ -1442,7 +1433,7 @@
     <w:next w:val="Normal"/>
     <w:link w:val="QuoteChar"/>
     <w:autoRedefine/>
-    <w:rsid w:val="00B22E66"/>
+    <w:rsid w:val="0089352B"/>
     <w:pPr>
       <w:pBdr>
         <w:left w:val="single" w:sz="24" w:space="4" w:color="auto"/>
@@ -1460,7 +1451,7 @@
     <w:name w:val="Quote Char"/>
     <w:basedOn w:val="DefaultParagraphFont"/>
     <w:link w:val="Quote"/>
-    <w:rsid w:val="00B22E66"/>
+    <w:rsid w:val="0089352B"/>
     <w:rPr>
       <w:i/>
       <w:iCs/>

</xml_diff>